<commit_message>
Overlay display mirrors the source's line structure
Adam's request: the shaded display followed no line breaks — one
endless run — while the input box keeps the ACIP file's returns.
The display builder now counts tokens per source line (same
tokenizer) and emits the file's own newlines, including blank
lines, after each line-final token; if the per-line counts do not
reconcile with the document's tokens it falls back to the
continuous layout rather than guessing. Works in all three display
scripts. Selftest: +1 check (two lines + a blank line mirror
exactly) = 72; distribution docs and Help updated.

Co-Authored-By: Claude Fable 5 <noreply@anthropic.com>
</commit_message>
<xml_diff>
--- a/docs/distribution/COMPLETE_FEATURE_GUIDE.docx
+++ b/docs/distribution/COMPLETE_FEATURE_GUIDE.docx
@@ -4664,13 +4664,13 @@
         <w:t xml:space="preserve">--selftest</w:t>
       </w:r>
       <w:r>
-        <w:t xml:space="preserve">: 71 checks print PASS/FAIL and localize the</w:t>
-      </w:r>
-      <w:r>
-        <w:t xml:space="preserve"> </w:t>
-      </w:r>
-      <w:r>
-        <w:t xml:space="preserve">problem. (38 automated test batteries also run before any change to</w:t>
+        <w:t xml:space="preserve">: 72 checks print PASS/FAIL and localize the</w:t>
+      </w:r>
+      <w:r>
+        <w:t xml:space="preserve"> </w:t>
+      </w:r>
+      <w:r>
+        <w:t xml:space="preserve">problem. (thirty-eight automated test batteries also run before any change to</w:t>
       </w:r>
       <w:r>
         <w:t xml:space="preserve"> </w:t>
@@ -5576,7 +5576,7 @@
         <w:t xml:space="preserve"> </w:t>
       </w:r>
       <w:r>
-        <w:t xml:space="preserve">from Terminal (71 checks,</w:t>
+        <w:t xml:space="preserve">from Terminal (72 checks,</w:t>
       </w:r>
       <w:r>
         <w:t xml:space="preserve"> </w:t>

</xml_diff>

<commit_message>
Manuscript pane (task #56): rich-text writing surface + Gofer sidebar
Adam's post-demo Tier 1. First tab of the Translate group.
- Rich-text editor: B/I/U + size on selection, Tibetan paste keeps
  shape, lossless .html storage, autosave per minute once named,
  RTF export via textutil, reopens last manuscript.
- Gofer sidebar: full grammar (OR, NEAR/N) over the aligned corpus;
  every hit shows the master's English beside the Tibetan; 'insert'
  places that English at the cursor — matched, never composed.
- Selftest: +3 checks (bold, corpus reach, save/reopen) = 75.
- Help chapter + workflows step; distribution papers updated to
  seventeen panes, docx + Desktop copies regenerated.

Co-Authored-By: Claude Fable 5 <noreply@anthropic.com>
</commit_message>
<xml_diff>
--- a/docs/distribution/COMPLETE_FEATURE_GUIDE.docx
+++ b/docs/distribution/COMPLETE_FEATURE_GUIDE.docx
@@ -2,7 +2,7 @@
 <file path=word/document.xml><?xml version="1.0" encoding="utf-8"?>
 <w:document xmlns:w="http://schemas.openxmlformats.org/wordprocessingml/2006/main" xmlns:m="http://schemas.openxmlformats.org/officeDocument/2006/math" xmlns:r="http://schemas.openxmlformats.org/officeDocument/2006/relationships" xmlns:o="urn:schemas-microsoft-com:office:office" xmlns:v="urn:schemas-microsoft-com:vml" xmlns:w10="urn:schemas-microsoft-com:office:word" xmlns:a="http://schemas.openxmlformats.org/drawingml/2006/main" xmlns:pic="http://schemas.openxmlformats.org/drawingml/2006/picture" xmlns:wp="http://schemas.openxmlformats.org/drawingml/2006/wordprocessingDrawing">
   <w:body>
-    <w:bookmarkStart w:id="37" w:name="Xf47977d38443c35d5f581baec88248880980e5f"/>
+    <w:bookmarkStart w:id="38" w:name="Xf47977d38443c35d5f581baec88248880980e5f"/>
     <w:p>
       <w:pPr>
         <w:pStyle w:val="Heading1"/>
@@ -314,7 +314,7 @@
         <w:t xml:space="preserve"> </w:t>
       </w:r>
       <w:r>
-        <w:t xml:space="preserve">inside each, a second row holds its panes — sixteen in all:</w:t>
+        <w:t xml:space="preserve">inside each, a second row holds its panes — seventeen in all:</w:t>
       </w:r>
     </w:p>
     <w:tbl>
@@ -429,7 +429,7 @@
               <w:pStyle w:val="Compact"/>
             </w:pPr>
             <w:r>
-              <w:t xml:space="preserve">Draft, Review, Align</w:t>
+              <w:t xml:space="preserve">Manuscript, Draft, Review, Align</w:t>
             </w:r>
           </w:p>
         </w:tc>
@@ -440,7 +440,7 @@
               <w:pStyle w:val="Compact"/>
             </w:pPr>
             <w:r>
-              <w:t xml:space="preserve">the bench, the overseer, the dictionary-builder</w:t>
+              <w:t xml:space="preserve">the page, the bench, the overseer, the dictionary-builder</w:t>
             </w:r>
           </w:p>
         </w:tc>
@@ -1770,7 +1770,7 @@
     </w:p>
     <w:bookmarkEnd w:id="11"/>
     <w:bookmarkEnd w:id="12"/>
-    <w:bookmarkStart w:id="16" w:name="translate"/>
+    <w:bookmarkStart w:id="17" w:name="translate"/>
     <w:p>
       <w:pPr>
         <w:pStyle w:val="Heading2"/>
@@ -1779,12 +1779,278 @@
         <w:t xml:space="preserve">3. TRANSLATE</w:t>
       </w:r>
     </w:p>
-    <w:bookmarkStart w:id="13" w:name="draft-the-working-translators-bench"/>
+    <w:bookmarkStart w:id="13" w:name="manuscript-the-writing-surface"/>
     <w:p>
       <w:pPr>
         <w:pStyle w:val="Heading3"/>
       </w:pPr>
       <w:r>
+        <w:t xml:space="preserve">3.0 Manuscript — the writing surface</w:t>
+      </w:r>
+    </w:p>
+    <w:p>
+      <w:pPr>
+        <w:pStyle w:val="FirstParagraph"/>
+      </w:pPr>
+      <w:r>
+        <w:rPr>
+          <w:i/>
+          <w:iCs/>
+        </w:rPr>
+        <w:t xml:space="preserve">Translate → Manuscript. The manuscript itself, with the corpus one</w:t>
+      </w:r>
+      <w:r>
+        <w:rPr>
+          <w:i/>
+          <w:iCs/>
+        </w:rPr>
+        <w:t xml:space="preserve"> </w:t>
+      </w:r>
+      <w:r>
+        <w:rPr>
+          <w:i/>
+          <w:iCs/>
+        </w:rPr>
+        <w:t xml:space="preserve">keystroke away.</w:t>
+      </w:r>
+    </w:p>
+    <w:p>
+      <w:pPr>
+        <w:pStyle w:val="BodyText"/>
+      </w:pPr>
+      <w:r>
+        <w:t xml:space="preserve">Write in the big editor —</w:t>
+      </w:r>
+      <w:r>
+        <w:t xml:space="preserve"> </w:t>
+      </w:r>
+      <w:r>
+        <w:rPr>
+          <w:b/>
+          <w:bCs/>
+        </w:rPr>
+        <w:t xml:space="preserve">B / I / U</w:t>
+      </w:r>
+      <w:r>
+        <w:t xml:space="preserve"> </w:t>
+      </w:r>
+      <w:r>
+        <w:t xml:space="preserve">and the size control apply</w:t>
+      </w:r>
+      <w:r>
+        <w:t xml:space="preserve"> </w:t>
+      </w:r>
+      <w:r>
+        <w:t xml:space="preserve">to the selection, and pasted Tibetan script keeps its shape.</w:t>
+      </w:r>
+      <w:r>
+        <w:t xml:space="preserve"> </w:t>
+      </w:r>
+      <w:r>
+        <w:rPr>
+          <w:b/>
+          <w:bCs/>
+        </w:rPr>
+        <w:t xml:space="preserve">Save</w:t>
+      </w:r>
+      <w:r>
+        <w:rPr>
+          <w:b/>
+          <w:bCs/>
+        </w:rPr>
+        <w:t xml:space="preserve"> </w:t>
+      </w:r>
+      <w:r>
+        <w:rPr>
+          <w:b/>
+          <w:bCs/>
+        </w:rPr>
+        <w:t xml:space="preserve">as…</w:t>
+      </w:r>
+      <w:r>
+        <w:t xml:space="preserve"> </w:t>
+      </w:r>
+      <w:r>
+        <w:t xml:space="preserve">names the manuscript (stored losslessly as .html); after that</w:t>
+      </w:r>
+      <w:r>
+        <w:t xml:space="preserve"> </w:t>
+      </w:r>
+      <w:r>
+        <w:t xml:space="preserve">it autosaves every minute,</w:t>
+      </w:r>
+      <w:r>
+        <w:t xml:space="preserve"> </w:t>
+      </w:r>
+      <w:r>
+        <w:rPr>
+          <w:b/>
+          <w:bCs/>
+        </w:rPr>
+        <w:t xml:space="preserve">Save</w:t>
+      </w:r>
+      <w:r>
+        <w:t xml:space="preserve"> </w:t>
+      </w:r>
+      <w:r>
+        <w:t xml:space="preserve">is always there, and</w:t>
+      </w:r>
+      <w:r>
+        <w:t xml:space="preserve"> </w:t>
+      </w:r>
+      <w:r>
+        <w:rPr>
+          <w:b/>
+          <w:bCs/>
+        </w:rPr>
+        <w:t xml:space="preserve">Export</w:t>
+      </w:r>
+      <w:r>
+        <w:rPr>
+          <w:b/>
+          <w:bCs/>
+        </w:rPr>
+        <w:t xml:space="preserve"> </w:t>
+      </w:r>
+      <w:r>
+        <w:rPr>
+          <w:b/>
+          <w:bCs/>
+        </w:rPr>
+        <w:t xml:space="preserve">RTF…</w:t>
+      </w:r>
+      <w:r>
+        <w:t xml:space="preserve"> </w:t>
+      </w:r>
+      <w:r>
+        <w:t xml:space="preserve">produces a file for Word or Pages. The pane reopens your</w:t>
+      </w:r>
+      <w:r>
+        <w:t xml:space="preserve"> </w:t>
+      </w:r>
+      <w:r>
+        <w:t xml:space="preserve">last manuscript on launch.</w:t>
+      </w:r>
+    </w:p>
+    <w:p>
+      <w:pPr>
+        <w:pStyle w:val="BodyText"/>
+      </w:pPr>
+      <w:r>
+        <w:t xml:space="preserve">The</w:t>
+      </w:r>
+      <w:r>
+        <w:t xml:space="preserve"> </w:t>
+      </w:r>
+      <w:r>
+        <w:rPr>
+          <w:b/>
+          <w:bCs/>
+        </w:rPr>
+        <w:t xml:space="preserve">search sidebar</w:t>
+      </w:r>
+      <w:r>
+        <w:t xml:space="preserve"> </w:t>
+      </w:r>
+      <w:r>
+        <w:t xml:space="preserve">(toggle it with</w:t>
+      </w:r>
+      <w:r>
+        <w:t xml:space="preserve"> </w:t>
+      </w:r>
+      <w:r>
+        <w:t xml:space="preserve">“Search sidebar”</w:t>
+      </w:r>
+      <w:r>
+        <w:t xml:space="preserve">) speaks the</w:t>
+      </w:r>
+      <w:r>
+        <w:t xml:space="preserve"> </w:t>
+      </w:r>
+      <w:r>
+        <w:t xml:space="preserve">full Gofer grammar —</w:t>
+      </w:r>
+      <w:r>
+        <w:t xml:space="preserve"> </w:t>
+      </w:r>
+      <w:r>
+        <w:rPr>
+          <w:rStyle w:val="VerbatimChar"/>
+        </w:rPr>
+        <w:t xml:space="preserve">bden pa</w:t>
+      </w:r>
+      <w:r>
+        <w:t xml:space="preserve">,</w:t>
+      </w:r>
+      <w:r>
+        <w:t xml:space="preserve"> </w:t>
+      </w:r>
+      <w:r>
+        <w:rPr>
+          <w:rStyle w:val="VerbatimChar"/>
+        </w:rPr>
+        <w:t xml:space="preserve">stong OR bden</w:t>
+      </w:r>
+      <w:r>
+        <w:t xml:space="preserve">,</w:t>
+      </w:r>
+      <w:r>
+        <w:t xml:space="preserve"> </w:t>
+      </w:r>
+      <w:r>
+        <w:rPr>
+          <w:rStyle w:val="VerbatimChar"/>
+        </w:rPr>
+        <w:t xml:space="preserve">"sdug bsngal" NEAR/5 "bden pa"</w:t>
+      </w:r>
+      <w:r>
+        <w:t xml:space="preserve"> </w:t>
+      </w:r>
+      <w:r>
+        <w:t xml:space="preserve">— over the aligned corpus. Every hit shows the</w:t>
+      </w:r>
+      <w:r>
+        <w:t xml:space="preserve"> </w:t>
+      </w:r>
+      <w:r>
+        <w:t xml:space="preserve">master’s English in bold beside the Tibetan, and</w:t>
+      </w:r>
+      <w:r>
+        <w:t xml:space="preserve"> </w:t>
+      </w:r>
+      <w:r>
+        <w:rPr>
+          <w:b/>
+          <w:bCs/>
+        </w:rPr>
+        <w:t xml:space="preserve">insert</w:t>
+      </w:r>
+      <w:r>
+        <w:t xml:space="preserve"> </w:t>
+      </w:r>
+      <w:r>
+        <w:t xml:space="preserve">places</w:t>
+      </w:r>
+      <w:r>
+        <w:t xml:space="preserve"> </w:t>
+      </w:r>
+      <w:r>
+        <w:t xml:space="preserve">that English at your cursor: matched from his corpus, never</w:t>
+      </w:r>
+      <w:r>
+        <w:t xml:space="preserve"> </w:t>
+      </w:r>
+      <w:r>
+        <w:t xml:space="preserve">composed.</w:t>
+      </w:r>
+    </w:p>
+    <w:bookmarkEnd w:id="13"/>
+    <w:bookmarkStart w:id="14" w:name="draft-the-working-translators-bench"/>
+    <w:p>
+      <w:pPr>
+        <w:pStyle w:val="Heading3"/>
+      </w:pPr>
+      <w:r>
         <w:t xml:space="preserve">3.1 Draft — the working translator’s bench</w:t>
       </w:r>
     </w:p>
@@ -2186,8 +2452,8 @@
         <w:t xml:space="preserve">retranslate.</w:t>
       </w:r>
     </w:p>
-    <w:bookmarkEnd w:id="13"/>
-    <w:bookmarkStart w:id="14" w:name="review-the-overseers-bench"/>
+    <w:bookmarkEnd w:id="14"/>
+    <w:bookmarkStart w:id="15" w:name="review-the-overseers-bench"/>
     <w:p>
       <w:pPr>
         <w:pStyle w:val="Heading3"/>
@@ -2329,8 +2595,8 @@
         <w:t xml:space="preserve">reuse, don’t rewrite.</w:t>
       </w:r>
     </w:p>
-    <w:bookmarkEnd w:id="14"/>
-    <w:bookmarkStart w:id="15" w:name="align-building-tomorrows-dictionary"/>
+    <w:bookmarkEnd w:id="15"/>
+    <w:bookmarkStart w:id="16" w:name="align-building-tomorrows-dictionary"/>
     <w:p>
       <w:pPr>
         <w:pStyle w:val="Heading3"/>
@@ -2514,9 +2780,9 @@
         </w:pict>
       </w:r>
     </w:p>
-    <w:bookmarkEnd w:id="15"/>
     <w:bookmarkEnd w:id="16"/>
-    <w:bookmarkStart w:id="22" w:name="research"/>
+    <w:bookmarkEnd w:id="17"/>
+    <w:bookmarkStart w:id="23" w:name="research"/>
     <w:p>
       <w:pPr>
         <w:pStyle w:val="Heading2"/>
@@ -2525,7 +2791,7 @@
         <w:t xml:space="preserve">4. RESEARCH</w:t>
       </w:r>
     </w:p>
-    <w:bookmarkStart w:id="17" w:name="search-gofer-restored"/>
+    <w:bookmarkStart w:id="18" w:name="search-gofer-restored"/>
     <w:p>
       <w:pPr>
         <w:pStyle w:val="Heading3"/>
@@ -2894,8 +3160,8 @@
         <w:t xml:space="preserve">every hit.</w:t>
       </w:r>
     </w:p>
-    <w:bookmarkEnd w:id="17"/>
-    <w:bookmarkStart w:id="18" w:name="lookup-the-stacked-dictionary"/>
+    <w:bookmarkEnd w:id="18"/>
+    <w:bookmarkStart w:id="19" w:name="lookup-the-stacked-dictionary"/>
     <w:p>
       <w:pPr>
         <w:pStyle w:val="Heading3"/>
@@ -3043,8 +3309,8 @@
         <w:t xml:space="preserve">at the bottom files a proposal for the searched term.</w:t>
       </w:r>
     </w:p>
-    <w:bookmarkEnd w:id="18"/>
-    <w:bookmarkStart w:id="19" w:name="sanskrit-the-whole-stack"/>
+    <w:bookmarkEnd w:id="19"/>
+    <w:bookmarkStart w:id="20" w:name="sanskrit-the-whole-stack"/>
     <w:p>
       <w:pPr>
         <w:pStyle w:val="Heading3"/>
@@ -3231,8 +3497,8 @@
         <w:t xml:space="preserve">instructions appear if it is missing).</w:t>
       </w:r>
     </w:p>
-    <w:bookmarkEnd w:id="19"/>
-    <w:bookmarkStart w:id="20" w:name="X92e68a2f6802e6895d1bc016fd93bb7a8f1c69d"/>
+    <w:bookmarkEnd w:id="20"/>
+    <w:bookmarkStart w:id="21" w:name="X92e68a2f6802e6895d1bc016fd93bb7a8f1c69d"/>
     <w:p>
       <w:pPr>
         <w:pStyle w:val="Heading3"/>
@@ -3319,8 +3585,8 @@
         <w:t xml:space="preserve">own irregularities rather than smoothing them.</w:t>
       </w:r>
     </w:p>
-    <w:bookmarkEnd w:id="20"/>
-    <w:bookmarkStart w:id="21" w:name="analysis-the-eighteen-section-report"/>
+    <w:bookmarkEnd w:id="21"/>
+    <w:bookmarkStart w:id="22" w:name="analysis-the-eighteen-section-report"/>
     <w:p>
       <w:pPr>
         <w:pStyle w:val="Heading3"/>
@@ -3428,9 +3694,9 @@
         </w:pict>
       </w:r>
     </w:p>
-    <w:bookmarkEnd w:id="21"/>
     <w:bookmarkEnd w:id="22"/>
-    <w:bookmarkStart w:id="25" w:name="learn"/>
+    <w:bookmarkEnd w:id="23"/>
+    <w:bookmarkStart w:id="26" w:name="learn"/>
     <w:p>
       <w:pPr>
         <w:pStyle w:val="Heading2"/>
@@ -3439,7 +3705,7 @@
         <w:t xml:space="preserve">5. LEARN</w:t>
       </w:r>
     </w:p>
-    <w:bookmarkStart w:id="23" w:name="trainer-reading-layer-by-layer"/>
+    <w:bookmarkStart w:id="24" w:name="trainer-reading-layer-by-layer"/>
     <w:p>
       <w:pPr>
         <w:pStyle w:val="Heading3"/>
@@ -3599,8 +3865,8 @@
         <w:t xml:space="preserve">of the Dots, reproducing the book’s own diagrams.</w:t>
       </w:r>
     </w:p>
-    <w:bookmarkEnd w:id="23"/>
-    <w:bookmarkStart w:id="24" w:name="drills-exercises-that-write-themselves"/>
+    <w:bookmarkEnd w:id="24"/>
+    <w:bookmarkStart w:id="25" w:name="drills-exercises-that-write-themselves"/>
     <w:p>
       <w:pPr>
         <w:pStyle w:val="Heading3"/>
@@ -3736,9 +4002,9 @@
         </w:pict>
       </w:r>
     </w:p>
-    <w:bookmarkEnd w:id="24"/>
     <w:bookmarkEnd w:id="25"/>
-    <w:bookmarkStart w:id="28" w:name="input"/>
+    <w:bookmarkEnd w:id="26"/>
+    <w:bookmarkStart w:id="29" w:name="input"/>
     <w:p>
       <w:pPr>
         <w:pStyle w:val="Heading2"/>
@@ -3747,7 +4013,7 @@
         <w:t xml:space="preserve">6. INPUT</w:t>
       </w:r>
     </w:p>
-    <w:bookmarkStart w:id="26" w:name="input-the-input-center-workstation"/>
+    <w:bookmarkStart w:id="27" w:name="input-the-input-center-workstation"/>
     <w:p>
       <w:pPr>
         <w:pStyle w:val="Heading3"/>
@@ -3970,8 +4236,8 @@
         <w:t xml:space="preserve">exports the block.</w:t>
       </w:r>
     </w:p>
-    <w:bookmarkEnd w:id="26"/>
-    <w:bookmarkStart w:id="27" w:name="X4573d24ce61769f6d56b23e48ababeceff7a981"/>
+    <w:bookmarkEnd w:id="27"/>
+    <w:bookmarkStart w:id="28" w:name="X4573d24ce61769f6d56b23e48ababeceff7a981"/>
     <w:p>
       <w:pPr>
         <w:pStyle w:val="Heading3"/>
@@ -4104,9 +4370,9 @@
         </w:pict>
       </w:r>
     </w:p>
-    <w:bookmarkEnd w:id="27"/>
     <w:bookmarkEnd w:id="28"/>
-    <w:bookmarkStart w:id="31" w:name="community"/>
+    <w:bookmarkEnd w:id="29"/>
+    <w:bookmarkStart w:id="32" w:name="community"/>
     <w:p>
       <w:pPr>
         <w:pStyle w:val="Heading2"/>
@@ -4115,7 +4381,7 @@
         <w:t xml:space="preserve">7. COMMUNITY</w:t>
       </w:r>
     </w:p>
-    <w:bookmarkStart w:id="29" w:name="X24fe6ee6f9f1813410744eb24c89dc533736087"/>
+    <w:bookmarkStart w:id="30" w:name="X24fe6ee6f9f1813410744eb24c89dc533736087"/>
     <w:p>
       <w:pPr>
         <w:pStyle w:val="Heading3"/>
@@ -4272,8 +4538,8 @@
         <w:t xml:space="preserve">each of yours with its status and the authority’s comment.</w:t>
       </w:r>
     </w:p>
-    <w:bookmarkEnd w:id="29"/>
-    <w:bookmarkStart w:id="30" w:name="approval-the-authoritys-queue"/>
+    <w:bookmarkEnd w:id="30"/>
+    <w:bookmarkStart w:id="31" w:name="approval-the-authoritys-queue"/>
     <w:p>
       <w:pPr>
         <w:pStyle w:val="Heading3"/>
@@ -4463,9 +4729,9 @@
         </w:pict>
       </w:r>
     </w:p>
-    <w:bookmarkEnd w:id="30"/>
     <w:bookmarkEnd w:id="31"/>
-    <w:bookmarkStart w:id="32" w:name="settings-menus-and-help"/>
+    <w:bookmarkEnd w:id="32"/>
+    <w:bookmarkStart w:id="33" w:name="settings-menus-and-help"/>
     <w:p>
       <w:pPr>
         <w:pStyle w:val="Heading2"/>
@@ -4686,8 +4952,8 @@
         </w:pict>
       </w:r>
     </w:p>
-    <w:bookmarkEnd w:id="32"/>
-    <w:bookmarkStart w:id="35" w:name="suggested-workflows"/>
+    <w:bookmarkEnd w:id="33"/>
+    <w:bookmarkStart w:id="36" w:name="suggested-workflows"/>
     <w:p>
       <w:pPr>
         <w:pStyle w:val="Heading2"/>
@@ -4710,7 +4976,7 @@
         <w:t xml:space="preserve">role. Each step names its tab path.</w:t>
       </w:r>
     </w:p>
-    <w:bookmarkStart w:id="33" w:name="by-task"/>
+    <w:bookmarkStart w:id="34" w:name="by-task"/>
     <w:p>
       <w:pPr>
         <w:pStyle w:val="Heading3"/>
@@ -4995,8 +5261,8 @@
         <w:t xml:space="preserve">Research → Convert.</w:t>
       </w:r>
     </w:p>
-    <w:bookmarkEnd w:id="33"/>
-    <w:bookmarkStart w:id="34" w:name="by-role"/>
+    <w:bookmarkEnd w:id="34"/>
+    <w:bookmarkStart w:id="35" w:name="by-role"/>
     <w:p>
       <w:pPr>
         <w:pStyle w:val="Heading3"/>
@@ -5362,9 +5628,9 @@
         </w:pict>
       </w:r>
     </w:p>
-    <w:bookmarkEnd w:id="34"/>
     <w:bookmarkEnd w:id="35"/>
-    <w:bookmarkStart w:id="36" w:name="appendix"/>
+    <w:bookmarkEnd w:id="36"/>
+    <w:bookmarkStart w:id="37" w:name="appendix"/>
     <w:p>
       <w:pPr>
         <w:pStyle w:val="Heading2"/>
@@ -5613,7 +5879,7 @@
           <w:i/>
           <w:iCs/>
         </w:rPr>
-        <w:t xml:space="preserve">Sixteen panes, one principle: the machine may match the master’s</w:t>
+        <w:t xml:space="preserve">Seventeen panes, one principle: the machine may match the master’s</w:t>
       </w:r>
       <w:r>
         <w:rPr>
@@ -5630,8 +5896,8 @@
         <w:t xml:space="preserve">English — it may never compose it.</w:t>
       </w:r>
     </w:p>
-    <w:bookmarkEnd w:id="36"/>
     <w:bookmarkEnd w:id="37"/>
+    <w:bookmarkEnd w:id="38"/>
     <w:sectPr>
       <w:footnotePr>
         <w:numRestart w:val="eachSect"/>

</xml_diff>

<commit_message>
Menu bar mirrors the GUI + workflows 'Where do I start?' opener
Adam's requests:
- The 19 per-pane menus collapse to 8: one menu per workflow group
  (Read/Translate/Research/Learn/Input/Community), one submenu per
  pane, actions still derived generically from the panes' own
  buttons and toggles. Anything found in the window is in the same
  place in the menus. View + Help follow the groups.
- Suggested Workflows chapter opens with 'Where do I start?' — six
  role lines pointing first-time users at the right recipe.
- Selftest menu checks retitled for the mirrored structure (75).
- Help + feature guide wording updated; guide docx regenerated.

Co-Authored-By: Claude Fable 5 <noreply@anthropic.com>
</commit_message>
<xml_diff>
--- a/docs/distribution/COMPLETE_FEATURE_GUIDE.docx
+++ b/docs/distribution/COMPLETE_FEATURE_GUIDE.docx
@@ -644,29 +644,13 @@
         <w:t xml:space="preserve"> </w:t>
       </w:r>
       <w:r>
-        <w:t xml:space="preserve">Every pane’s functions are</w:t>
-      </w:r>
-      <w:r>
-        <w:t xml:space="preserve"> </w:t>
-      </w:r>
-      <w:r>
-        <w:rPr>
-          <w:i/>
-          <w:iCs/>
-        </w:rPr>
-        <w:t xml:space="preserve">also</w:t>
-      </w:r>
-      <w:r>
-        <w:t xml:space="preserve"> </w:t>
-      </w:r>
-      <w:r>
-        <w:t xml:space="preserve">in the menu bar — one dropdown per</w:t>
-      </w:r>
-      <w:r>
-        <w:t xml:space="preserve"> </w:t>
-      </w:r>
-      <w:r>
-        <w:t xml:space="preserve">pane, reachable no matter which tab is in front — and on a Mac the</w:t>
+        <w:t xml:space="preserve">The menu bar mirrors this structure exactly — one menu per workflow,</w:t>
+      </w:r>
+      <w:r>
+        <w:t xml:space="preserve"> </w:t>
+      </w:r>
+      <w:r>
+        <w:t xml:space="preserve">one submenu per pane, every function inside — and on a Mac the</w:t>
       </w:r>
       <w:r>
         <w:t xml:space="preserve"> </w:t>
@@ -4809,13 +4793,19 @@
         <w:t xml:space="preserve"> </w:t>
       </w:r>
       <w:r>
-        <w:t xml:space="preserve">One dropdown per pane carries every one of its functions</w:t>
-      </w:r>
-      <w:r>
-        <w:t xml:space="preserve"> </w:t>
-      </w:r>
-      <w:r>
-        <w:t xml:space="preserve">— the menu bar reaches everything no matter which tab is in front.</w:t>
+        <w:t xml:space="preserve">The menu bar mirrors the window: one menu per workflow</w:t>
+      </w:r>
+      <w:r>
+        <w:t xml:space="preserve"> </w:t>
+      </w:r>
+      <w:r>
+        <w:t xml:space="preserve">group, one submenu per pane, every function inside — reachable no</w:t>
+      </w:r>
+      <w:r>
+        <w:t xml:space="preserve"> </w:t>
+      </w:r>
+      <w:r>
+        <w:t xml:space="preserve">matter which tab is in front.</w:t>
       </w:r>
     </w:p>
     <w:p>

</xml_diff>

<commit_message>
Idioms register (task #60): banked list + proposal kind + card badges
Adam's request: start a list of idioms. The register marks WHICH
strings are idioms/fixed expressions — English stays the
dictionary's (rule 1 untouched).
- data/idioms/idioms.json: 5 seeds, all machine-identified fixed
  phrases from the 2026-08-06 na-boundary corpus calibration
  (dper na, des na, kho na, 'o na, bla na), each provenance-tagged
  and status 'proposed' — never guessed, never pre-approved.
- ProposalKind::Idiom ('idiom', export lane) in all three proposal
  pickers; Approval pane 'Idioms' filter.
- Entry cards carry an IDIOM badge everywhere (amber '(proposed)'
  until ruled; green once approved), evidence in the tooltip.
- Packaging manifest ships data/idioms. Selftest 77; Help + papers
  updated; proposals battery +2 checks.

Co-Authored-By: Claude Fable 5 <noreply@anthropic.com>
</commit_message>
<xml_diff>
--- a/docs/distribution/COMPLETE_FEATURE_GUIDE.docx
+++ b/docs/distribution/COMPLETE_FEATURE_GUIDE.docx
@@ -4920,7 +4920,7 @@
         <w:t xml:space="preserve">--selftest</w:t>
       </w:r>
       <w:r>
-        <w:t xml:space="preserve">: 72 checks print PASS/FAIL and localize the</w:t>
+        <w:t xml:space="preserve">: 77 checks print PASS/FAIL and localize the</w:t>
       </w:r>
       <w:r>
         <w:t xml:space="preserve"> </w:t>
@@ -5832,7 +5832,7 @@
         <w:t xml:space="preserve"> </w:t>
       </w:r>
       <w:r>
-        <w:t xml:space="preserve">from Terminal (72 checks,</w:t>
+        <w:t xml:space="preserve">from Terminal (77 checks,</w:t>
       </w:r>
       <w:r>
         <w:t xml:space="preserve"> </w:t>

</xml_diff>

<commit_message>
Documentation in totality: user ops + release engineering + truth-pass
Nine new/refreshed documents (Adam's release push, 2026-08-11):
- User ops: INSTALL_QUICK_START, TROUBLESHOOTING_FAQ,
  DATA_AND_PRIVACY, AUTHORITY_ADMIN_GUIDE (docs/distribution/).
- Release engineering: RELEASE_NOTES_v0.27.2, RELEASE_CHECKLIST,
  DEVELOPER_ONBOARDING.
- Truth-pass over TECHNICAL_OVERVIEW / README /
  APP_FUNCTIONS_AND_DESIGN (seventeen panes, six groups, 38 suites,
  80 checks, 2234/705 apparatus, GMR click mode, Manuscript +
  Sanskrit sections added) + dated preservation note on DEMO_SCRIPT.
- Check-count refs updated to 80 everywhere; docx set regenerated;
  Desktop distribution folder now carries eight documents + DMG.

Co-Authored-By: Claude Fable 5 <noreply@anthropic.com>
</commit_message>
<xml_diff>
--- a/docs/distribution/COMPLETE_FEATURE_GUIDE.docx
+++ b/docs/distribution/COMPLETE_FEATURE_GUIDE.docx
@@ -4926,7 +4926,7 @@
         <w:t xml:space="preserve">--selftest</w:t>
       </w:r>
       <w:r>
-        <w:t xml:space="preserve">: 78 checks print PASS/FAIL and localize the</w:t>
+        <w:t xml:space="preserve">: 80 checks print PASS/FAIL and localize the</w:t>
       </w:r>
       <w:r>
         <w:t xml:space="preserve"> </w:t>
@@ -5838,7 +5838,7 @@
         <w:t xml:space="preserve"> </w:t>
       </w:r>
       <w:r>
-        <w:t xml:space="preserve">from Terminal (78 checks,</w:t>
+        <w:t xml:space="preserve">from Terminal (80 checks,</w:t>
       </w:r>
       <w:r>
         <w:t xml:space="preserve"> </w:t>

</xml_diff>

<commit_message>
Docs refresh: teaching moments, Das, gallery, idioms in the release set
Feature guide + release notes carry the Aug-11 features; check
counts updated to 84 across the distribution documents; docx +
Desktop copies regenerated.

Co-Authored-By: Claude Fable 5 <noreply@anthropic.com>
</commit_message>
<xml_diff>
--- a/docs/distribution/COMPLETE_FEATURE_GUIDE.docx
+++ b/docs/distribution/COMPLETE_FEATURE_GUIDE.docx
@@ -1433,6 +1433,156 @@
       </w:pPr>
       <w:r>
         <w:rPr>
+          <w:b/>
+          <w:bCs/>
+        </w:rPr>
+        <w:t xml:space="preserve">Teachings and references on every card.</w:t>
+      </w:r>
+      <w:r>
+        <w:t xml:space="preserve"> </w:t>
+      </w:r>
+      <w:r>
+        <w:t xml:space="preserve">Entry cards now carry:</w:t>
+      </w:r>
+      <w:r>
+        <w:t xml:space="preserve"> </w:t>
+      </w:r>
+      <w:r>
+        <w:t xml:space="preserve">a</w:t>
+      </w:r>
+      <w:r>
+        <w:t xml:space="preserve"> </w:t>
+      </w:r>
+      <w:r>
+        <w:rPr>
+          <w:b/>
+          <w:bCs/>
+        </w:rPr>
+        <w:t xml:space="preserve">“Geshe Michael teaching this term”</w:t>
+      </w:r>
+      <w:r>
+        <w:t xml:space="preserve"> </w:t>
+      </w:r>
+      <w:r>
+        <w:t xml:space="preserve">section — timecoded links</w:t>
+      </w:r>
+      <w:r>
+        <w:t xml:space="preserve"> </w:t>
+      </w:r>
+      <w:r>
+        <w:t xml:space="preserve">into his recorded classes (machine-located from class captions; the</w:t>
+      </w:r>
+      <w:r>
+        <w:t xml:space="preserve"> </w:t>
+      </w:r>
+      <w:r>
+        <w:t xml:space="preserve">recording is the authority; non-English sessions tagged); a</w:t>
+      </w:r>
+      <w:r>
+        <w:t xml:space="preserve"> </w:t>
+      </w:r>
+      <w:r>
+        <w:rPr>
+          <w:b/>
+          <w:bCs/>
+        </w:rPr>
+        <w:t xml:space="preserve">“He</w:t>
+      </w:r>
+      <w:r>
+        <w:rPr>
+          <w:b/>
+          <w:bCs/>
+        </w:rPr>
+        <w:t xml:space="preserve"> </w:t>
+      </w:r>
+      <w:r>
+        <w:rPr>
+          <w:b/>
+          <w:bCs/>
+        </w:rPr>
+        <w:t xml:space="preserve">says this word”</w:t>
+      </w:r>
+      <w:r>
+        <w:t xml:space="preserve"> </w:t>
+      </w:r>
+      <w:r>
+        <w:t xml:space="preserve">tier locating moments where he speaks the Tibetan</w:t>
+      </w:r>
+      <w:r>
+        <w:t xml:space="preserve"> </w:t>
+      </w:r>
+      <w:r>
+        <w:t xml:space="preserve">itself (phonetic match on his own convention — candidates,</w:t>
+      </w:r>
+      <w:r>
+        <w:t xml:space="preserve"> </w:t>
+      </w:r>
+      <w:r>
+        <w:t xml:space="preserve">homophones share moments); and a</w:t>
+      </w:r>
+      <w:r>
+        <w:t xml:space="preserve"> </w:t>
+      </w:r>
+      <w:r>
+        <w:rPr>
+          <w:b/>
+          <w:bCs/>
+        </w:rPr>
+        <w:t xml:space="preserve">“Das 1902 · ~p.N”</w:t>
+      </w:r>
+      <w:r>
+        <w:t xml:space="preserve"> </w:t>
+      </w:r>
+      <w:r>
+        <w:t xml:space="preserve">link opening</w:t>
+      </w:r>
+      <w:r>
+        <w:t xml:space="preserve"> </w:t>
+      </w:r>
+      <w:r>
+        <w:t xml:space="preserve">Sarat Chandra Das’s dictionary inside the app at approximately the</w:t>
+      </w:r>
+      <w:r>
+        <w:t xml:space="preserve"> </w:t>
+      </w:r>
+      <w:r>
+        <w:t xml:space="preserve">entry’s page (public domain, clearly a reference). And in REVIEW:</w:t>
+      </w:r>
+      <w:r>
+        <w:t xml:space="preserve"> </w:t>
+      </w:r>
+      <w:r>
+        <w:rPr>
+          <w:b/>
+          <w:bCs/>
+        </w:rPr>
+        <w:t xml:space="preserve">“Teachings for this text…”</w:t>
+      </w:r>
+      <w:r>
+        <w:t xml:space="preserve"> </w:t>
+      </w:r>
+      <w:r>
+        <w:t xml:space="preserve">sweeps every term the loaded text</w:t>
+      </w:r>
+      <w:r>
+        <w:t xml:space="preserve"> </w:t>
+      </w:r>
+      <w:r>
+        <w:t xml:space="preserve">contains and reports where he taught each one — the translator’s</w:t>
+      </w:r>
+      <w:r>
+        <w:t xml:space="preserve"> </w:t>
+      </w:r>
+      <w:r>
+        <w:t xml:space="preserve">companion sheet.</w:t>
+      </w:r>
+    </w:p>
+    <w:p>
+      <w:pPr>
+        <w:pStyle w:val="BodyText"/>
+      </w:pPr>
+      <w:r>
+        <w:rPr>
           <w:i/>
           <w:iCs/>
         </w:rPr>
@@ -4257,6 +4407,70 @@
           <w:b/>
           <w:bCs/>
         </w:rPr>
+        <w:t xml:space="preserve">“mark illustration candidates”</w:t>
+      </w:r>
+      <w:r>
+        <w:t xml:space="preserve"> </w:t>
+      </w:r>
+      <w:r>
+        <w:t xml:space="preserve">outlines folio regions not</w:t>
+      </w:r>
+      <w:r>
+        <w:t xml:space="preserve"> </w:t>
+      </w:r>
+      <w:r>
+        <w:t xml:space="preserve">covered by detected text lines — where woodblock miniatures live —</w:t>
+      </w:r>
+      <w:r>
+        <w:t xml:space="preserve"> </w:t>
+      </w:r>
+      <w:r>
+        <w:t xml:space="preserve">and</w:t>
+      </w:r>
+      <w:r>
+        <w:t xml:space="preserve"> </w:t>
+      </w:r>
+      <w:r>
+        <w:rPr>
+          <w:b/>
+          <w:bCs/>
+        </w:rPr>
+        <w:t xml:space="preserve">“Illustration gallery…”</w:t>
+      </w:r>
+      <w:r>
+        <w:t xml:space="preserve"> </w:t>
+      </w:r>
+      <w:r>
+        <w:t xml:space="preserve">runs that search across a whole</w:t>
+      </w:r>
+      <w:r>
+        <w:t xml:space="preserve"> </w:t>
+      </w:r>
+      <w:r>
+        <w:t xml:space="preserve">folder, showing the crops as a gallery (save them named by source</w:t>
+      </w:r>
+      <w:r>
+        <w:t xml:space="preserve"> </w:t>
+      </w:r>
+      <w:r>
+        <w:t xml:space="preserve">page). Candidates only, never claimed complete. The Overlay’s SCANS</w:t>
+      </w:r>
+      <w:r>
+        <w:t xml:space="preserve"> </w:t>
+      </w:r>
+      <w:r>
+        <w:t xml:space="preserve">column offers the same gallery over a linked volume’s cached pages.</w:t>
+      </w:r>
+    </w:p>
+    <w:p>
+      <w:pPr>
+        <w:pStyle w:val="BodyText"/>
+      </w:pPr>
+      <w:r>
+        <w:rPr>
+          <w:b/>
+          <w:bCs/>
+        </w:rPr>
         <w:t xml:space="preserve">Open scan image…</w:t>
       </w:r>
       <w:r>
@@ -4926,7 +5140,7 @@
         <w:t xml:space="preserve">--selftest</w:t>
       </w:r>
       <w:r>
-        <w:t xml:space="preserve">: 80 checks print PASS/FAIL and localize the</w:t>
+        <w:t xml:space="preserve">: 84 checks print PASS/FAIL and localize the</w:t>
       </w:r>
       <w:r>
         <w:t xml:space="preserve"> </w:t>
@@ -5838,7 +6052,7 @@
         <w:t xml:space="preserve"> </w:t>
       </w:r>
       <w:r>
-        <w:t xml:space="preserve">from Terminal (80 checks,</w:t>
+        <w:t xml:space="preserve">from Terminal (84 checks,</w:t>
       </w:r>
       <w:r>
         <w:t xml:space="preserve"> </w:t>

</xml_diff>